<commit_message>
feat: Navigation - Zeiterfassung & Allg. Arbeitszeit zu einem Menüpunkt zusammengeführt
</commit_message>
<xml_diff>
--- a/ANLEITUNG.docx
+++ b/ANLEITUNG.docx
@@ -2,7 +2,7 @@
 <file path=word/document.xml><?xml version="1.0" encoding="utf-8"?>
 <w:document xmlns:w="http://schemas.openxmlformats.org/wordprocessingml/2006/main" xmlns:m="http://schemas.openxmlformats.org/officeDocument/2006/math" xmlns:r="http://schemas.openxmlformats.org/officeDocument/2006/relationships" xmlns:o="urn:schemas-microsoft-com:office:office" xmlns:v="urn:schemas-microsoft-com:vml" xmlns:w10="urn:schemas-microsoft-com:office:word" xmlns:a="http://schemas.openxmlformats.org/drawingml/2006/main" xmlns:pic="http://schemas.openxmlformats.org/drawingml/2006/picture" xmlns:wp="http://schemas.openxmlformats.org/drawingml/2006/wordprocessingDrawing">
   <w:body>
-    <w:bookmarkStart w:id="31" w:name="X604d8ca1d223f18e2778d47b60bd11ddc14ba25"/>
+    <w:bookmarkStart w:id="37" w:name="X604d8ca1d223f18e2778d47b60bd11ddc14ba25"/>
     <w:p>
       <w:pPr>
         <w:pStyle w:val="Heading1"/>
@@ -1204,7 +1204,7 @@
     </w:p>
     <w:bookmarkEnd w:id="26"/>
     <w:bookmarkEnd w:id="27"/>
-    <w:bookmarkStart w:id="28" w:name="allgemeine-arbeitszeit-anwesenheit"/>
+    <w:bookmarkStart w:id="34" w:name="allgemeine-arbeitszeit-anwesenheit"/>
     <w:p>
       <w:pPr>
         <w:pStyle w:val="Heading2"/>
@@ -1312,11 +1312,756 @@
         <w:t xml:space="preserve">bist und deine tägliche Anwesenheit dokumentieren musst.</w:t>
       </w:r>
     </w:p>
+    <w:bookmarkStart w:id="30" w:name="tagesarten-und-abwesenheiten"/>
+    <w:p>
+      <w:pPr>
+        <w:pStyle w:val="Heading3"/>
+      </w:pPr>
+      <w:r>
+        <w:t xml:space="preserve">Tagesarten und Abwesenheiten</w:t>
+      </w:r>
+    </w:p>
     <w:p>
       <w:pPr>
         <w:pStyle w:val="FirstParagraph"/>
       </w:pPr>
       <w:r>
+        <w:t xml:space="preserve">Jeder Tag kann jetzt einer von</w:t>
+      </w:r>
+      <w:r>
+        <w:t xml:space="preserve"> </w:t>
+      </w:r>
+      <w:r>
+        <w:rPr>
+          <w:bCs/>
+          <w:b/>
+        </w:rPr>
+        <w:t xml:space="preserve">fünf Arten</w:t>
+      </w:r>
+      <w:r>
+        <w:t xml:space="preserve"> </w:t>
+      </w:r>
+      <w:r>
+        <w:t xml:space="preserve">zugeordnet werden:</w:t>
+      </w:r>
+    </w:p>
+    <w:tbl>
+      <w:tblPr>
+        <w:tblStyle w:val="Table"/>
+        <w:tblW w:type="pct" w:w="5000"/>
+        <w:tblLook w:firstRow="1" w:lastRow="0" w:firstColumn="0" w:lastColumn="0" w:noHBand="0" w:noVBand="0" w:val="0020"/>
+      </w:tblPr>
+      <w:tblGrid>
+        <w:gridCol w:w="1980"/>
+        <w:gridCol w:w="1980"/>
+        <w:gridCol w:w="1980"/>
+        <w:gridCol w:w="1980"/>
+      </w:tblGrid>
+      <w:tr>
+        <w:trPr>
+          <w:tblHeader w:val="true"/>
+        </w:trPr>
+        <w:tc>
+          <w:tcPr/>
+          <w:p>
+            <w:pPr>
+              <w:pStyle w:val="Compact"/>
+              <w:jc w:val="left"/>
+            </w:pPr>
+            <w:r>
+              <w:t xml:space="preserve">Art</w:t>
+            </w:r>
+          </w:p>
+        </w:tc>
+        <w:tc>
+          <w:tcPr/>
+          <w:p>
+            <w:pPr>
+              <w:pStyle w:val="Compact"/>
+              <w:jc w:val="left"/>
+            </w:pPr>
+            <w:r>
+              <w:t xml:space="preserve">Symbol</w:t>
+            </w:r>
+          </w:p>
+        </w:tc>
+        <w:tc>
+          <w:tcPr/>
+          <w:p>
+            <w:pPr>
+              <w:pStyle w:val="Compact"/>
+              <w:jc w:val="left"/>
+            </w:pPr>
+            <w:r>
+              <w:t xml:space="preserve">Beschreibung</w:t>
+            </w:r>
+          </w:p>
+        </w:tc>
+        <w:tc>
+          <w:tcPr/>
+          <w:p>
+            <w:pPr>
+              <w:pStyle w:val="Compact"/>
+              <w:jc w:val="left"/>
+            </w:pPr>
+            <w:r>
+              <w:t xml:space="preserve">Zeitfelder</w:t>
+            </w:r>
+          </w:p>
+        </w:tc>
+      </w:tr>
+      <w:tr>
+        <w:tc>
+          <w:tcPr/>
+          <w:p>
+            <w:pPr>
+              <w:pStyle w:val="Compact"/>
+              <w:jc w:val="left"/>
+            </w:pPr>
+            <w:r>
+              <w:rPr>
+                <w:bCs/>
+                <w:b/>
+              </w:rPr>
+              <w:t xml:space="preserve">Reguläre Arbeitszeit</w:t>
+            </w:r>
+          </w:p>
+        </w:tc>
+        <w:tc>
+          <w:tcPr/>
+          <w:p>
+            <w:pPr>
+              <w:pStyle w:val="Compact"/>
+              <w:jc w:val="left"/>
+            </w:pPr>
+            <w:r>
+              <w:t xml:space="preserve">grau</w:t>
+            </w:r>
+          </w:p>
+        </w:tc>
+        <w:tc>
+          <w:tcPr/>
+          <w:p>
+            <w:pPr>
+              <w:pStyle w:val="Compact"/>
+              <w:jc w:val="left"/>
+            </w:pPr>
+            <w:r>
+              <w:t xml:space="preserve">Normaler Arbeitstag</w:t>
+            </w:r>
+          </w:p>
+        </w:tc>
+        <w:tc>
+          <w:tcPr/>
+          <w:p>
+            <w:pPr>
+              <w:pStyle w:val="Compact"/>
+              <w:jc w:val="left"/>
+            </w:pPr>
+            <w:r>
+              <w:t xml:space="preserve">Kommen, Gehen, Pause erforderlich</w:t>
+            </w:r>
+          </w:p>
+        </w:tc>
+      </w:tr>
+      <w:tr>
+        <w:tc>
+          <w:tcPr/>
+          <w:p>
+            <w:pPr>
+              <w:pStyle w:val="Compact"/>
+              <w:jc w:val="left"/>
+            </w:pPr>
+            <w:r>
+              <w:rPr>
+                <w:bCs/>
+                <w:b/>
+              </w:rPr>
+              <w:t xml:space="preserve">Urlaub</w:t>
+            </w:r>
+          </w:p>
+        </w:tc>
+        <w:tc>
+          <w:tcPr/>
+          <w:p>
+            <w:pPr>
+              <w:pStyle w:val="Compact"/>
+              <w:jc w:val="left"/>
+            </w:pPr>
+            <w:r>
+              <w:t xml:space="preserve">🌴 blau</w:t>
+            </w:r>
+          </w:p>
+        </w:tc>
+        <w:tc>
+          <w:tcPr/>
+          <w:p>
+            <w:pPr>
+              <w:pStyle w:val="Compact"/>
+              <w:jc w:val="left"/>
+            </w:pPr>
+            <w:r>
+              <w:t xml:space="preserve">Urlaubstag</w:t>
+            </w:r>
+          </w:p>
+        </w:tc>
+        <w:tc>
+          <w:tcPr/>
+          <w:p>
+            <w:pPr>
+              <w:pStyle w:val="Compact"/>
+              <w:jc w:val="left"/>
+            </w:pPr>
+            <w:r>
+              <w:t xml:space="preserve">Optional: nur bei Halbtag</w:t>
+            </w:r>
+          </w:p>
+        </w:tc>
+      </w:tr>
+      <w:tr>
+        <w:tc>
+          <w:tcPr/>
+          <w:p>
+            <w:pPr>
+              <w:pStyle w:val="Compact"/>
+              <w:jc w:val="left"/>
+            </w:pPr>
+            <w:r>
+              <w:rPr>
+                <w:bCs/>
+                <w:b/>
+              </w:rPr>
+              <w:t xml:space="preserve">Krankheit</w:t>
+            </w:r>
+          </w:p>
+        </w:tc>
+        <w:tc>
+          <w:tcPr/>
+          <w:p>
+            <w:pPr>
+              <w:pStyle w:val="Compact"/>
+              <w:jc w:val="left"/>
+            </w:pPr>
+            <w:r>
+              <w:t xml:space="preserve">🩺 orange</w:t>
+            </w:r>
+          </w:p>
+        </w:tc>
+        <w:tc>
+          <w:tcPr/>
+          <w:p>
+            <w:pPr>
+              <w:pStyle w:val="Compact"/>
+              <w:jc w:val="left"/>
+            </w:pPr>
+            <w:r>
+              <w:t xml:space="preserve">Krankheitstag</w:t>
+            </w:r>
+          </w:p>
+        </w:tc>
+        <w:tc>
+          <w:tcPr/>
+          <w:p>
+            <w:pPr>
+              <w:pStyle w:val="Compact"/>
+              <w:jc w:val="left"/>
+            </w:pPr>
+            <w:r>
+              <w:t xml:space="preserve">Optional: nur bei Halbtag</w:t>
+            </w:r>
+          </w:p>
+        </w:tc>
+      </w:tr>
+      <w:tr>
+        <w:tc>
+          <w:tcPr/>
+          <w:p>
+            <w:pPr>
+              <w:pStyle w:val="Compact"/>
+              <w:jc w:val="left"/>
+            </w:pPr>
+            <w:r>
+              <w:rPr>
+                <w:bCs/>
+                <w:b/>
+              </w:rPr>
+              <w:t xml:space="preserve">Sonderurlaub</w:t>
+            </w:r>
+          </w:p>
+        </w:tc>
+        <w:tc>
+          <w:tcPr/>
+          <w:p>
+            <w:pPr>
+              <w:pStyle w:val="Compact"/>
+              <w:jc w:val="left"/>
+            </w:pPr>
+            <w:r>
+              <w:t xml:space="preserve">💼 lila</w:t>
+            </w:r>
+          </w:p>
+        </w:tc>
+        <w:tc>
+          <w:tcPr/>
+          <w:p>
+            <w:pPr>
+              <w:pStyle w:val="Compact"/>
+              <w:jc w:val="left"/>
+            </w:pPr>
+            <w:r>
+              <w:t xml:space="preserve">Sonderurlaub (z. B. Umzug, Hochzeit)</w:t>
+            </w:r>
+          </w:p>
+        </w:tc>
+        <w:tc>
+          <w:tcPr/>
+          <w:p>
+            <w:pPr>
+              <w:pStyle w:val="Compact"/>
+              <w:jc w:val="left"/>
+            </w:pPr>
+            <w:r>
+              <w:t xml:space="preserve">Optional: nur bei Halbtag</w:t>
+            </w:r>
+          </w:p>
+        </w:tc>
+      </w:tr>
+      <w:tr>
+        <w:tc>
+          <w:tcPr/>
+          <w:p>
+            <w:pPr>
+              <w:pStyle w:val="Compact"/>
+              <w:jc w:val="left"/>
+            </w:pPr>
+            <w:r>
+              <w:rPr>
+                <w:bCs/>
+                <w:b/>
+              </w:rPr>
+              <w:t xml:space="preserve">Elternzeit</w:t>
+            </w:r>
+          </w:p>
+        </w:tc>
+        <w:tc>
+          <w:tcPr/>
+          <w:p>
+            <w:pPr>
+              <w:pStyle w:val="Compact"/>
+              <w:jc w:val="left"/>
+            </w:pPr>
+            <w:r>
+              <w:t xml:space="preserve">👶 grün</w:t>
+            </w:r>
+          </w:p>
+        </w:tc>
+        <w:tc>
+          <w:tcPr/>
+          <w:p>
+            <w:pPr>
+              <w:pStyle w:val="Compact"/>
+              <w:jc w:val="left"/>
+            </w:pPr>
+            <w:r>
+              <w:t xml:space="preserve">Elternzeit</w:t>
+            </w:r>
+          </w:p>
+        </w:tc>
+        <w:tc>
+          <w:tcPr/>
+          <w:p>
+            <w:pPr>
+              <w:pStyle w:val="Compact"/>
+              <w:jc w:val="left"/>
+            </w:pPr>
+            <w:r>
+              <w:t xml:space="preserve">Keine Zeitfelder</w:t>
+            </w:r>
+          </w:p>
+        </w:tc>
+      </w:tr>
+    </w:tbl>
+    <w:bookmarkStart w:id="28" w:name="ganztags-abwesenheit-vs.-halbtag"/>
+    <w:p>
+      <w:pPr>
+        <w:pStyle w:val="Heading4"/>
+      </w:pPr>
+      <w:r>
+        <w:t xml:space="preserve">Ganztags-Abwesenheit vs. Halbtag</w:t>
+      </w:r>
+    </w:p>
+    <w:p>
+      <w:pPr>
+        <w:numPr>
+          <w:ilvl w:val="0"/>
+          <w:numId w:val="1010"/>
+        </w:numPr>
+        <w:pStyle w:val="Compact"/>
+      </w:pPr>
+      <w:r>
+        <w:rPr>
+          <w:bCs/>
+          <w:b/>
+        </w:rPr>
+        <w:t xml:space="preserve">Ganztags-Abwesenheit:</w:t>
+      </w:r>
+      <w:r>
+        <w:t xml:space="preserve"> </w:t>
+      </w:r>
+      <w:r>
+        <w:t xml:space="preserve">Wähle die entsprechende Tagesart (z. B. „Urlaub”) – die Zeitfelder (Kommen/Gehen/Pause) werden automatisch ausgeblendet. Der Tag gilt als vollständig abwesend.</w:t>
+      </w:r>
+    </w:p>
+    <w:p>
+      <w:pPr>
+        <w:numPr>
+          <w:ilvl w:val="0"/>
+          <w:numId w:val="1010"/>
+        </w:numPr>
+        <w:pStyle w:val="Compact"/>
+      </w:pPr>
+      <w:r>
+        <w:rPr>
+          <w:bCs/>
+          <w:b/>
+        </w:rPr>
+        <w:t xml:space="preserve">Halber Tag:</w:t>
+      </w:r>
+      <w:r>
+        <w:t xml:space="preserve"> </w:t>
+      </w:r>
+      <w:r>
+        <w:t xml:space="preserve">Aktiviere die Checkbox</w:t>
+      </w:r>
+      <w:r>
+        <w:t xml:space="preserve"> </w:t>
+      </w:r>
+      <w:r>
+        <w:rPr>
+          <w:bCs/>
+          <w:b/>
+        </w:rPr>
+        <w:t xml:space="preserve">„Halber Tag”</w:t>
+      </w:r>
+      <w:r>
+        <w:t xml:space="preserve"> </w:t>
+      </w:r>
+      <w:r>
+        <w:t xml:space="preserve">– die Zeitfelder bleiben sichtbar, sodass du den gearbeiteten halben Tag erfassen kannst (z. B. Vormittag Urlaub, Nachmittag gearbeitet).</w:t>
+      </w:r>
+    </w:p>
+    <w:bookmarkEnd w:id="28"/>
+    <w:bookmarkStart w:id="29" w:name="X6837e56af27baccb748564d808019b3b55e248d"/>
+    <w:p>
+      <w:pPr>
+        <w:pStyle w:val="Heading4"/>
+      </w:pPr>
+      <w:r>
+        <w:t xml:space="preserve">Sollzeit-Berechnung: Anrechnung vs. Neutralisierung</w:t>
+      </w:r>
+    </w:p>
+    <w:p>
+      <w:pPr>
+        <w:pStyle w:val="FirstParagraph"/>
+      </w:pPr>
+      <w:r>
+        <w:t xml:space="preserve">Die Tagesart beeinflusst, wie der Tag in die</w:t>
+      </w:r>
+      <w:r>
+        <w:t xml:space="preserve"> </w:t>
+      </w:r>
+      <w:r>
+        <w:rPr>
+          <w:bCs/>
+          <w:b/>
+        </w:rPr>
+        <w:t xml:space="preserve">monatliche Sollzeit</w:t>
+      </w:r>
+      <w:r>
+        <w:t xml:space="preserve"> </w:t>
+      </w:r>
+      <w:r>
+        <w:t xml:space="preserve">einfließt:</w:t>
+      </w:r>
+    </w:p>
+    <w:p>
+      <w:pPr>
+        <w:numPr>
+          <w:ilvl w:val="0"/>
+          <w:numId w:val="1011"/>
+        </w:numPr>
+        <w:pStyle w:val="Compact"/>
+      </w:pPr>
+      <w:r>
+        <w:rPr>
+          <w:bCs/>
+          <w:b/>
+        </w:rPr>
+        <w:t xml:space="preserve">Reguläre Arbeitszeit:</w:t>
+      </w:r>
+      <w:r>
+        <w:t xml:space="preserve"> </w:t>
+      </w:r>
+      <w:r>
+        <w:t xml:space="preserve">Zählt zur Sollzeit, die gearbeiteten Stunden werden erfasst.</w:t>
+      </w:r>
+    </w:p>
+    <w:p>
+      <w:pPr>
+        <w:numPr>
+          <w:ilvl w:val="0"/>
+          <w:numId w:val="1011"/>
+        </w:numPr>
+        <w:pStyle w:val="Compact"/>
+      </w:pPr>
+      <w:r>
+        <w:rPr>
+          <w:bCs/>
+          <w:b/>
+        </w:rPr>
+        <w:t xml:space="preserve">Urlaub / Krankheit / Sonderurlaub:</w:t>
+      </w:r>
+      <w:r>
+        <w:t xml:space="preserve"> </w:t>
+      </w:r>
+      <w:r>
+        <w:t xml:space="preserve">Der Tag wird</w:t>
+      </w:r>
+      <w:r>
+        <w:t xml:space="preserve"> </w:t>
+      </w:r>
+      <w:r>
+        <w:rPr>
+          <w:bCs/>
+          <w:b/>
+        </w:rPr>
+        <w:t xml:space="preserve">angerechnet</w:t>
+      </w:r>
+      <w:r>
+        <w:t xml:space="preserve"> </w:t>
+      </w:r>
+      <w:r>
+        <w:t xml:space="preserve">– er zählt zur Sollzeit UND gilt als erfüllt (wird dem Zeitkonto gutgeschrieben). Dein Saldo bleibt neutral.</w:t>
+      </w:r>
+    </w:p>
+    <w:p>
+      <w:pPr>
+        <w:numPr>
+          <w:ilvl w:val="1"/>
+          <w:numId w:val="1012"/>
+        </w:numPr>
+        <w:pStyle w:val="Compact"/>
+      </w:pPr>
+      <w:r>
+        <w:rPr>
+          <w:bCs/>
+          <w:b/>
+        </w:rPr>
+        <w:t xml:space="preserve">Ganztag:</w:t>
+      </w:r>
+      <w:r>
+        <w:t xml:space="preserve"> </w:t>
+      </w:r>
+      <w:r>
+        <w:t xml:space="preserve">volle Tagessollzeit (z. B. 8 Stunden) wird gutgeschrieben</w:t>
+      </w:r>
+    </w:p>
+    <w:p>
+      <w:pPr>
+        <w:numPr>
+          <w:ilvl w:val="1"/>
+          <w:numId w:val="1012"/>
+        </w:numPr>
+        <w:pStyle w:val="Compact"/>
+      </w:pPr>
+      <w:r>
+        <w:rPr>
+          <w:bCs/>
+          <w:b/>
+        </w:rPr>
+        <w:t xml:space="preserve">Halbtag:</w:t>
+      </w:r>
+      <w:r>
+        <w:t xml:space="preserve"> </w:t>
+      </w:r>
+      <w:r>
+        <w:t xml:space="preserve">halbe Tagessollzeit (z. B. 4 Stunden) wird gutgeschrieben, die gearbeiteten Stunden werden zusätzlich erfasst</w:t>
+      </w:r>
+    </w:p>
+    <w:p>
+      <w:pPr>
+        <w:numPr>
+          <w:ilvl w:val="0"/>
+          <w:numId w:val="1011"/>
+        </w:numPr>
+        <w:pStyle w:val="Compact"/>
+      </w:pPr>
+      <w:r>
+        <w:rPr>
+          <w:bCs/>
+          <w:b/>
+        </w:rPr>
+        <w:t xml:space="preserve">Elternzeit:</w:t>
+      </w:r>
+      <w:r>
+        <w:t xml:space="preserve"> </w:t>
+      </w:r>
+      <w:r>
+        <w:t xml:space="preserve">Der Tag wird</w:t>
+      </w:r>
+      <w:r>
+        <w:t xml:space="preserve"> </w:t>
+      </w:r>
+      <w:r>
+        <w:rPr>
+          <w:bCs/>
+          <w:b/>
+        </w:rPr>
+        <w:t xml:space="preserve">neutralisiert</w:t>
+      </w:r>
+      <w:r>
+        <w:t xml:space="preserve"> </w:t>
+      </w:r>
+      <w:r>
+        <w:t xml:space="preserve">– er fällt komplett aus der Sollzeit heraus (weder Soll noch Ist). Die monatliche Sollzeit reduziert sich entsprechend.</w:t>
+      </w:r>
+    </w:p>
+    <w:p>
+      <w:pPr>
+        <w:pStyle w:val="FirstParagraph"/>
+      </w:pPr>
+      <w:r>
+        <w:rPr>
+          <w:bCs/>
+          <w:b/>
+        </w:rPr>
+        <w:t xml:space="preserve">Beispiel:</w:t>
+      </w:r>
+      <w:r>
+        <w:t xml:space="preserve"> </w:t>
+      </w:r>
+      <w:r>
+        <w:t xml:space="preserve">20 Sollarbeitstage im Monat, davon 3 Tage Urlaub und 2 Tage Elternzeit:</w:t>
+      </w:r>
+      <w:r>
+        <w:t xml:space="preserve"> </w:t>
+      </w:r>
+      <w:r>
+        <w:t xml:space="preserve">- Sollzeit bleibt bei 20 Tagen (Urlaub zählt)</w:t>
+      </w:r>
+      <w:r>
+        <w:t xml:space="preserve"> </w:t>
+      </w:r>
+      <w:r>
+        <w:t xml:space="preserve">- Urlaub wird mit 3 × 8h = 24h gutgeschrieben</w:t>
+      </w:r>
+      <w:r>
+        <w:t xml:space="preserve"> </w:t>
+      </w:r>
+      <w:r>
+        <w:t xml:space="preserve">- Effektive Sollzeit reduziert sich auf 18 Tage (−2 Tage Elternzeit)</w:t>
+      </w:r>
+    </w:p>
+    <w:p>
+      <w:pPr>
+        <w:pStyle w:val="BodyText"/>
+      </w:pPr>
+      <w:r>
+        <w:t xml:space="preserve">Die</w:t>
+      </w:r>
+      <w:r>
+        <w:t xml:space="preserve"> </w:t>
+      </w:r>
+      <w:r>
+        <w:rPr>
+          <w:bCs/>
+          <w:b/>
+        </w:rPr>
+        <w:t xml:space="preserve">Metrikkarten</w:t>
+      </w:r>
+      <w:r>
+        <w:t xml:space="preserve"> </w:t>
+      </w:r>
+      <w:r>
+        <w:t xml:space="preserve">oben zeigen dir:</w:t>
+      </w:r>
+      <w:r>
+        <w:t xml:space="preserve"> </w:t>
+      </w:r>
+      <w:r>
+        <w:t xml:space="preserve">-</w:t>
+      </w:r>
+      <w:r>
+        <w:t xml:space="preserve"> </w:t>
+      </w:r>
+      <w:r>
+        <w:rPr>
+          <w:bCs/>
+          <w:b/>
+        </w:rPr>
+        <w:t xml:space="preserve">Sollstunden Monat</w:t>
+      </w:r>
+      <w:r>
+        <w:t xml:space="preserve"> </w:t>
+      </w:r>
+      <w:r>
+        <w:t xml:space="preserve">– inkl. Anzahl angerechneter Tage und Elternzeit-Tage</w:t>
+      </w:r>
+      <w:r>
+        <w:t xml:space="preserve"> </w:t>
+      </w:r>
+      <w:r>
+        <w:t xml:space="preserve">-</w:t>
+      </w:r>
+      <w:r>
+        <w:t xml:space="preserve"> </w:t>
+      </w:r>
+      <w:r>
+        <w:rPr>
+          <w:bCs/>
+          <w:b/>
+        </w:rPr>
+        <w:t xml:space="preserve">Ist-Stunden Monat</w:t>
+      </w:r>
+      <w:r>
+        <w:t xml:space="preserve"> </w:t>
+      </w:r>
+      <w:r>
+        <w:t xml:space="preserve">– inkl. gutgeschriebene Stunden</w:t>
+      </w:r>
+      <w:r>
+        <w:t xml:space="preserve"> </w:t>
+      </w:r>
+      <w:r>
+        <w:t xml:space="preserve">-</w:t>
+      </w:r>
+      <w:r>
+        <w:t xml:space="preserve"> </w:t>
+      </w:r>
+      <w:r>
+        <w:rPr>
+          <w:bCs/>
+          <w:b/>
+        </w:rPr>
+        <w:t xml:space="preserve">Überstunden-Saldo</w:t>
+      </w:r>
+    </w:p>
+    <w:bookmarkEnd w:id="29"/>
+    <w:bookmarkEnd w:id="30"/>
+    <w:bookmarkStart w:id="31" w:name="arbeitstag-erfassen"/>
+    <w:p>
+      <w:pPr>
+        <w:pStyle w:val="Heading3"/>
+      </w:pPr>
+      <w:r>
+        <w:t xml:space="preserve">Arbeitstag erfassen</w:t>
+      </w:r>
+    </w:p>
+    <w:p>
+      <w:pPr>
+        <w:pStyle w:val="FirstParagraph"/>
+      </w:pPr>
+      <w:r>
         <w:t xml:space="preserve">So erfasst du einen Arbeitstag:</w:t>
       </w:r>
     </w:p>
@@ -1324,7 +2069,7 @@
       <w:pPr>
         <w:numPr>
           <w:ilvl w:val="0"/>
-          <w:numId w:val="1010"/>
+          <w:numId w:val="1013"/>
         </w:numPr>
         <w:pStyle w:val="Compact"/>
       </w:pPr>
@@ -1349,12 +2094,68 @@
       <w:pPr>
         <w:numPr>
           <w:ilvl w:val="0"/>
-          <w:numId w:val="1010"/>
-        </w:numPr>
-        <w:pStyle w:val="Compact"/>
-      </w:pPr>
-      <w:r>
-        <w:t xml:space="preserve">Trage</w:t>
+          <w:numId w:val="1013"/>
+        </w:numPr>
+        <w:pStyle w:val="Compact"/>
+      </w:pPr>
+      <w:r>
+        <w:t xml:space="preserve">Wähle die</w:t>
+      </w:r>
+      <w:r>
+        <w:t xml:space="preserve"> </w:t>
+      </w:r>
+      <w:r>
+        <w:rPr>
+          <w:bCs/>
+          <w:b/>
+        </w:rPr>
+        <w:t xml:space="preserve">Art</w:t>
+      </w:r>
+      <w:r>
+        <w:t xml:space="preserve"> </w:t>
+      </w:r>
+      <w:r>
+        <w:t xml:space="preserve">des Tages (Standard: „Reguläre Arbeitszeit”).</w:t>
+      </w:r>
+    </w:p>
+    <w:p>
+      <w:pPr>
+        <w:numPr>
+          <w:ilvl w:val="0"/>
+          <w:numId w:val="1013"/>
+        </w:numPr>
+        <w:pStyle w:val="Compact"/>
+      </w:pPr>
+      <w:r>
+        <w:t xml:space="preserve">Bei Abwesenheiten: optional</w:t>
+      </w:r>
+      <w:r>
+        <w:t xml:space="preserve"> </w:t>
+      </w:r>
+      <w:r>
+        <w:rPr>
+          <w:bCs/>
+          <w:b/>
+        </w:rPr>
+        <w:t xml:space="preserve">„Halber Tag”</w:t>
+      </w:r>
+      <w:r>
+        <w:t xml:space="preserve"> </w:t>
+      </w:r>
+      <w:r>
+        <w:t xml:space="preserve">aktivieren.</w:t>
+      </w:r>
+    </w:p>
+    <w:p>
+      <w:pPr>
+        <w:numPr>
+          <w:ilvl w:val="0"/>
+          <w:numId w:val="1013"/>
+        </w:numPr>
+        <w:pStyle w:val="Compact"/>
+      </w:pPr>
+      <w:r>
+        <w:t xml:space="preserve">Bei regulärer Arbeit oder Halbtag:</w:t>
       </w:r>
       <w:r>
         <w:t xml:space="preserve"> </w:t>
@@ -1370,19 +2171,7 @@
         <w:t xml:space="preserve"> </w:t>
       </w:r>
       <w:r>
-        <w:t xml:space="preserve">(Startzeit) ein.</w:t>
-      </w:r>
-    </w:p>
-    <w:p>
-      <w:pPr>
-        <w:numPr>
-          <w:ilvl w:val="0"/>
-          <w:numId w:val="1010"/>
-        </w:numPr>
-        <w:pStyle w:val="Compact"/>
-      </w:pPr>
-      <w:r>
-        <w:t xml:space="preserve">Trage</w:t>
+        <w:t xml:space="preserve">(Startzeit),</w:t>
       </w:r>
       <w:r>
         <w:t xml:space="preserve"> </w:t>
@@ -1398,19 +2187,7 @@
         <w:t xml:space="preserve"> </w:t>
       </w:r>
       <w:r>
-        <w:t xml:space="preserve">(Endzeit) ein.</w:t>
-      </w:r>
-    </w:p>
-    <w:p>
-      <w:pPr>
-        <w:numPr>
-          <w:ilvl w:val="0"/>
-          <w:numId w:val="1010"/>
-        </w:numPr>
-        <w:pStyle w:val="Compact"/>
-      </w:pPr>
-      <w:r>
-        <w:t xml:space="preserve">Erfasse die</w:t>
+        <w:t xml:space="preserve">(Endzeit),</w:t>
       </w:r>
       <w:r>
         <w:t xml:space="preserve"> </w:t>
@@ -1423,14 +2200,17 @@
         <w:t xml:space="preserve">Pause (Min)</w:t>
       </w:r>
       <w:r>
-        <w:t xml:space="preserve">.</w:t>
-      </w:r>
-    </w:p>
-    <w:p>
-      <w:pPr>
-        <w:numPr>
-          <w:ilvl w:val="0"/>
-          <w:numId w:val="1010"/>
+        <w:t xml:space="preserve"> </w:t>
+      </w:r>
+      <w:r>
+        <w:t xml:space="preserve">eintragen.</w:t>
+      </w:r>
+    </w:p>
+    <w:p>
+      <w:pPr>
+        <w:numPr>
+          <w:ilvl w:val="0"/>
+          <w:numId w:val="1013"/>
         </w:numPr>
         <w:pStyle w:val="Compact"/>
       </w:pPr>
@@ -1458,7 +2238,7 @@
       <w:pPr>
         <w:numPr>
           <w:ilvl w:val="0"/>
-          <w:numId w:val="1010"/>
+          <w:numId w:val="1013"/>
         </w:numPr>
         <w:pStyle w:val="Compact"/>
       </w:pPr>
@@ -1473,17 +2253,194 @@
           <w:bCs/>
           <w:b/>
         </w:rPr>
-        <w:t xml:space="preserve">➕</w:t>
+        <w:t xml:space="preserve">➕ Speichern</w:t>
       </w:r>
       <w:r>
         <w:t xml:space="preserve">, um den Tag zu speichern.</w:t>
       </w:r>
     </w:p>
+    <w:bookmarkEnd w:id="31"/>
+    <w:bookmarkStart w:id="32" w:name="tageseinträge-bearbeiten"/>
+    <w:p>
+      <w:pPr>
+        <w:pStyle w:val="Heading3"/>
+      </w:pPr>
+      <w:r>
+        <w:t xml:space="preserve">Tageseinträge bearbeiten</w:t>
+      </w:r>
+    </w:p>
     <w:p>
       <w:pPr>
         <w:pStyle w:val="FirstParagraph"/>
       </w:pPr>
       <w:r>
+        <w:t xml:space="preserve">Jeder gespeicherte Tag kann nachträglich</w:t>
+      </w:r>
+      <w:r>
+        <w:t xml:space="preserve"> </w:t>
+      </w:r>
+      <w:r>
+        <w:rPr>
+          <w:bCs/>
+          <w:b/>
+        </w:rPr>
+        <w:t xml:space="preserve">bearbeitet</w:t>
+      </w:r>
+      <w:r>
+        <w:t xml:space="preserve"> </w:t>
+      </w:r>
+      <w:r>
+        <w:t xml:space="preserve">werden (außer in gesperrten Monaten):</w:t>
+      </w:r>
+    </w:p>
+    <w:p>
+      <w:pPr>
+        <w:numPr>
+          <w:ilvl w:val="0"/>
+          <w:numId w:val="1014"/>
+        </w:numPr>
+        <w:pStyle w:val="Compact"/>
+      </w:pPr>
+      <w:r>
+        <w:t xml:space="preserve">Klicke in der Tabelle auf</w:t>
+      </w:r>
+      <w:r>
+        <w:t xml:space="preserve"> </w:t>
+      </w:r>
+      <w:r>
+        <w:rPr>
+          <w:bCs/>
+          <w:b/>
+        </w:rPr>
+        <w:t xml:space="preserve">„Bearbeiten”</w:t>
+      </w:r>
+      <w:r>
+        <w:t xml:space="preserve"> </w:t>
+      </w:r>
+      <w:r>
+        <w:t xml:space="preserve">✏️ bei dem Tag, den du ändern möchtest.</w:t>
+      </w:r>
+    </w:p>
+    <w:p>
+      <w:pPr>
+        <w:numPr>
+          <w:ilvl w:val="0"/>
+          <w:numId w:val="1014"/>
+        </w:numPr>
+        <w:pStyle w:val="Compact"/>
+      </w:pPr>
+      <w:r>
+        <w:t xml:space="preserve">Der Eintrag wird ins Formular geladen –</w:t>
+      </w:r>
+      <w:r>
+        <w:t xml:space="preserve"> </w:t>
+      </w:r>
+      <w:r>
+        <w:rPr>
+          <w:bCs/>
+          <w:b/>
+        </w:rPr>
+        <w:t xml:space="preserve">alles</w:t>
+      </w:r>
+      <w:r>
+        <w:t xml:space="preserve"> </w:t>
+      </w:r>
+      <w:r>
+        <w:t xml:space="preserve">lässt sich korrigieren (Datum, Art, Zeiten, Notiz).</w:t>
+      </w:r>
+    </w:p>
+    <w:p>
+      <w:pPr>
+        <w:numPr>
+          <w:ilvl w:val="0"/>
+          <w:numId w:val="1014"/>
+        </w:numPr>
+        <w:pStyle w:val="Compact"/>
+      </w:pPr>
+      <w:r>
+        <w:t xml:space="preserve">Nimm die gewünschten Änderungen vor.</w:t>
+      </w:r>
+    </w:p>
+    <w:p>
+      <w:pPr>
+        <w:numPr>
+          <w:ilvl w:val="0"/>
+          <w:numId w:val="1014"/>
+        </w:numPr>
+        <w:pStyle w:val="Compact"/>
+      </w:pPr>
+      <w:r>
+        <w:t xml:space="preserve">Klicke auf</w:t>
+      </w:r>
+      <w:r>
+        <w:t xml:space="preserve"> </w:t>
+      </w:r>
+      <w:r>
+        <w:rPr>
+          <w:bCs/>
+          <w:b/>
+        </w:rPr>
+        <w:t xml:space="preserve">„Speichern”</w:t>
+      </w:r>
+      <w:r>
+        <w:t xml:space="preserve"> </w:t>
+      </w:r>
+      <w:r>
+        <w:t xml:space="preserve">oder</w:t>
+      </w:r>
+      <w:r>
+        <w:t xml:space="preserve"> </w:t>
+      </w:r>
+      <w:r>
+        <w:rPr>
+          <w:bCs/>
+          <w:b/>
+        </w:rPr>
+        <w:t xml:space="preserve">„Abbrechen”</w:t>
+      </w:r>
+      <w:r>
+        <w:t xml:space="preserve">, um die Bearbeitung zu verwerfen.</w:t>
+      </w:r>
+    </w:p>
+    <w:p>
+      <w:pPr>
+        <w:pStyle w:val="FirstParagraph"/>
+      </w:pPr>
+      <w:r>
+        <w:t xml:space="preserve">Alle Korrekturen werden</w:t>
+      </w:r>
+      <w:r>
+        <w:t xml:space="preserve"> </w:t>
+      </w:r>
+      <w:r>
+        <w:rPr>
+          <w:bCs/>
+          <w:b/>
+        </w:rPr>
+        <w:t xml:space="preserve">GoBD-konform im Audit-Log</w:t>
+      </w:r>
+      <w:r>
+        <w:t xml:space="preserve"> </w:t>
+      </w:r>
+      <w:r>
+        <w:t xml:space="preserve">protokolliert.</w:t>
+      </w:r>
+    </w:p>
+    <w:bookmarkEnd w:id="32"/>
+    <w:bookmarkStart w:id="33" w:name="tabelle-der-arbeitstage"/>
+    <w:p>
+      <w:pPr>
+        <w:pStyle w:val="Heading3"/>
+      </w:pPr>
+      <w:r>
+        <w:t xml:space="preserve">Tabelle der Arbeitstage</w:t>
+      </w:r>
+    </w:p>
+    <w:p>
+      <w:pPr>
+        <w:pStyle w:val="FirstParagraph"/>
+      </w:pPr>
+      <w:r>
         <w:t xml:space="preserve">In der Tabelle darunter siehst du je Tag:</w:t>
       </w:r>
     </w:p>
@@ -1491,7 +2448,45 @@
       <w:pPr>
         <w:numPr>
           <w:ilvl w:val="0"/>
-          <w:numId w:val="1011"/>
+          <w:numId w:val="1015"/>
+        </w:numPr>
+        <w:pStyle w:val="Compact"/>
+      </w:pPr>
+      <w:r>
+        <w:rPr>
+          <w:bCs/>
+          <w:b/>
+        </w:rPr>
+        <w:t xml:space="preserve">Datum</w:t>
+      </w:r>
+    </w:p>
+    <w:p>
+      <w:pPr>
+        <w:numPr>
+          <w:ilvl w:val="0"/>
+          <w:numId w:val="1015"/>
+        </w:numPr>
+        <w:pStyle w:val="Compact"/>
+      </w:pPr>
+      <w:r>
+        <w:rPr>
+          <w:bCs/>
+          <w:b/>
+        </w:rPr>
+        <w:t xml:space="preserve">Art</w:t>
+      </w:r>
+      <w:r>
+        <w:t xml:space="preserve"> </w:t>
+      </w:r>
+      <w:r>
+        <w:t xml:space="preserve">(farbiges Etikett mit Symbol; „· ½” bei Halbtagen)</w:t>
+      </w:r>
+    </w:p>
+    <w:p>
+      <w:pPr>
+        <w:numPr>
+          <w:ilvl w:val="0"/>
+          <w:numId w:val="1015"/>
         </w:numPr>
         <w:pStyle w:val="Compact"/>
       </w:pPr>
@@ -1502,12 +2497,18 @@
         </w:rPr>
         <w:t xml:space="preserve">Kommen – Gehen</w:t>
       </w:r>
-    </w:p>
-    <w:p>
-      <w:pPr>
-        <w:numPr>
-          <w:ilvl w:val="0"/>
-          <w:numId w:val="1011"/>
+      <w:r>
+        <w:t xml:space="preserve"> </w:t>
+      </w:r>
+      <w:r>
+        <w:t xml:space="preserve">(bei Ganztags-Abwesenheiten: „—“)</w:t>
+      </w:r>
+    </w:p>
+    <w:p>
+      <w:pPr>
+        <w:numPr>
+          <w:ilvl w:val="0"/>
+          <w:numId w:val="1015"/>
         </w:numPr>
         <w:pStyle w:val="Compact"/>
       </w:pPr>
@@ -1523,7 +2524,7 @@
       <w:pPr>
         <w:numPr>
           <w:ilvl w:val="0"/>
-          <w:numId w:val="1011"/>
+          <w:numId w:val="1015"/>
         </w:numPr>
         <w:pStyle w:val="Compact"/>
       </w:pPr>
@@ -1545,7 +2546,7 @@
       <w:pPr>
         <w:numPr>
           <w:ilvl w:val="0"/>
-          <w:numId w:val="1011"/>
+          <w:numId w:val="1015"/>
         </w:numPr>
         <w:pStyle w:val="Compact"/>
       </w:pPr>
@@ -1567,7 +2568,7 @@
       <w:pPr>
         <w:numPr>
           <w:ilvl w:val="0"/>
-          <w:numId w:val="1011"/>
+          <w:numId w:val="1015"/>
         </w:numPr>
         <w:pStyle w:val="Compact"/>
       </w:pPr>
@@ -1578,21 +2579,27 @@
         </w:rPr>
         <w:t xml:space="preserve">Notiz</w:t>
       </w:r>
-      <w:r>
-        <w:t xml:space="preserve"> </w:t>
-      </w:r>
-      <w:r>
-        <w:t xml:space="preserve">und</w:t>
-      </w:r>
-      <w:r>
-        <w:t xml:space="preserve"> </w:t>
-      </w:r>
-      <w:r>
-        <w:rPr>
-          <w:bCs/>
-          <w:b/>
-        </w:rPr>
-        <w:t xml:space="preserve">Status</w:t>
+    </w:p>
+    <w:p>
+      <w:pPr>
+        <w:numPr>
+          <w:ilvl w:val="0"/>
+          <w:numId w:val="1015"/>
+        </w:numPr>
+        <w:pStyle w:val="Compact"/>
+      </w:pPr>
+      <w:r>
+        <w:rPr>
+          <w:bCs/>
+          <w:b/>
+        </w:rPr>
+        <w:t xml:space="preserve">Aktionen</w:t>
+      </w:r>
+      <w:r>
+        <w:t xml:space="preserve"> </w:t>
+      </w:r>
+      <w:r>
+        <w:t xml:space="preserve">(Bearbeiten-Button)</w:t>
       </w:r>
     </w:p>
     <w:p>
@@ -1602,8 +2609,9 @@
         </w:pict>
       </w:r>
     </w:p>
-    <w:bookmarkEnd w:id="28"/>
-    <w:bookmarkStart w:id="29" w:name="X048a0b71a151d82d26917460f9b77f91a8aedc7"/>
+    <w:bookmarkEnd w:id="33"/>
+    <w:bookmarkEnd w:id="34"/>
+    <w:bookmarkStart w:id="35" w:name="X048a0b71a151d82d26917460f9b77f91a8aedc7"/>
     <w:p>
       <w:pPr>
         <w:pStyle w:val="Heading2"/>
@@ -1942,8 +2950,8 @@
         </w:pict>
       </w:r>
     </w:p>
-    <w:bookmarkEnd w:id="29"/>
-    <w:bookmarkStart w:id="30" w:name="häufige-fragen-kurz"/>
+    <w:bookmarkEnd w:id="35"/>
+    <w:bookmarkStart w:id="36" w:name="häufige-fragen-kurz"/>
     <w:p>
       <w:pPr>
         <w:pStyle w:val="Heading2"/>
@@ -1956,7 +2964,7 @@
       <w:pPr>
         <w:numPr>
           <w:ilvl w:val="0"/>
-          <w:numId w:val="1012"/>
+          <w:numId w:val="1016"/>
         </w:numPr>
         <w:pStyle w:val="Compact"/>
       </w:pPr>
@@ -1978,7 +2986,7 @@
       <w:pPr>
         <w:numPr>
           <w:ilvl w:val="0"/>
-          <w:numId w:val="1012"/>
+          <w:numId w:val="1016"/>
         </w:numPr>
         <w:pStyle w:val="Compact"/>
       </w:pPr>
@@ -2013,7 +3021,7 @@
       <w:pPr>
         <w:numPr>
           <w:ilvl w:val="0"/>
-          <w:numId w:val="1012"/>
+          <w:numId w:val="1016"/>
         </w:numPr>
         <w:pStyle w:val="Compact"/>
       </w:pPr>
@@ -2050,8 +3058,8 @@
         <w:t xml:space="preserve">Insight Arcs – Zeiterfassung &amp; Projekt-Forecast · DSGVO-konform (Hosting in Deutschland) · GoBD- &amp; ArbZG-konform</w:t>
       </w:r>
     </w:p>
-    <w:bookmarkEnd w:id="30"/>
-    <w:bookmarkEnd w:id="31"/>
+    <w:bookmarkEnd w:id="36"/>
+    <w:bookmarkEnd w:id="37"/>
     <w:sectPr/>
   </w:body>
 </w:document>
@@ -2458,39 +3466,78 @@
     <w:abstractNumId w:val="991"/>
   </w:num>
   <w:num w:numId="1010">
-    <w:abstractNumId w:val="99411"/>
-    <w:lvlOverride w:ilvl="0">
-      <w:startOverride w:val="1"/>
-    </w:lvlOverride>
-    <w:lvlOverride w:ilvl="1">
-      <w:startOverride w:val="1"/>
-    </w:lvlOverride>
-    <w:lvlOverride w:ilvl="2">
-      <w:startOverride w:val="1"/>
-    </w:lvlOverride>
-    <w:lvlOverride w:ilvl="3">
-      <w:startOverride w:val="1"/>
-    </w:lvlOverride>
-    <w:lvlOverride w:ilvl="4">
-      <w:startOverride w:val="1"/>
-    </w:lvlOverride>
-    <w:lvlOverride w:ilvl="5">
-      <w:startOverride w:val="1"/>
-    </w:lvlOverride>
-    <w:lvlOverride w:ilvl="6">
-      <w:startOverride w:val="1"/>
-    </w:lvlOverride>
-    <w:lvlOverride w:ilvl="7">
-      <w:startOverride w:val="1"/>
-    </w:lvlOverride>
-    <w:lvlOverride w:ilvl="8">
-      <w:startOverride w:val="1"/>
-    </w:lvlOverride>
+    <w:abstractNumId w:val="991"/>
   </w:num>
   <w:num w:numId="1011">
     <w:abstractNumId w:val="991"/>
   </w:num>
   <w:num w:numId="1012">
+    <w:abstractNumId w:val="991"/>
+  </w:num>
+  <w:num w:numId="1013">
+    <w:abstractNumId w:val="99411"/>
+    <w:lvlOverride w:ilvl="0">
+      <w:startOverride w:val="1"/>
+    </w:lvlOverride>
+    <w:lvlOverride w:ilvl="1">
+      <w:startOverride w:val="1"/>
+    </w:lvlOverride>
+    <w:lvlOverride w:ilvl="2">
+      <w:startOverride w:val="1"/>
+    </w:lvlOverride>
+    <w:lvlOverride w:ilvl="3">
+      <w:startOverride w:val="1"/>
+    </w:lvlOverride>
+    <w:lvlOverride w:ilvl="4">
+      <w:startOverride w:val="1"/>
+    </w:lvlOverride>
+    <w:lvlOverride w:ilvl="5">
+      <w:startOverride w:val="1"/>
+    </w:lvlOverride>
+    <w:lvlOverride w:ilvl="6">
+      <w:startOverride w:val="1"/>
+    </w:lvlOverride>
+    <w:lvlOverride w:ilvl="7">
+      <w:startOverride w:val="1"/>
+    </w:lvlOverride>
+    <w:lvlOverride w:ilvl="8">
+      <w:startOverride w:val="1"/>
+    </w:lvlOverride>
+  </w:num>
+  <w:num w:numId="1014">
+    <w:abstractNumId w:val="99411"/>
+    <w:lvlOverride w:ilvl="0">
+      <w:startOverride w:val="1"/>
+    </w:lvlOverride>
+    <w:lvlOverride w:ilvl="1">
+      <w:startOverride w:val="1"/>
+    </w:lvlOverride>
+    <w:lvlOverride w:ilvl="2">
+      <w:startOverride w:val="1"/>
+    </w:lvlOverride>
+    <w:lvlOverride w:ilvl="3">
+      <w:startOverride w:val="1"/>
+    </w:lvlOverride>
+    <w:lvlOverride w:ilvl="4">
+      <w:startOverride w:val="1"/>
+    </w:lvlOverride>
+    <w:lvlOverride w:ilvl="5">
+      <w:startOverride w:val="1"/>
+    </w:lvlOverride>
+    <w:lvlOverride w:ilvl="6">
+      <w:startOverride w:val="1"/>
+    </w:lvlOverride>
+    <w:lvlOverride w:ilvl="7">
+      <w:startOverride w:val="1"/>
+    </w:lvlOverride>
+    <w:lvlOverride w:ilvl="8">
+      <w:startOverride w:val="1"/>
+    </w:lvlOverride>
+  </w:num>
+  <w:num w:numId="1015">
+    <w:abstractNumId w:val="991"/>
+  </w:num>
+  <w:num w:numId="1016">
     <w:abstractNumId w:val="991"/>
   </w:num>
 </w:numbering>

</xml_diff>